<commit_message>
Roteiro Rick: ajuste factual na parte 4
Co-Authored-By: Claude Opus 5.5 <noreply@anthropic.com>
Claude-Session: https://claude.ai/code/session_01MJjUEEZrxQDEUifKK2vj9g
</commit_message>
<xml_diff>
--- a/roteiros/rick/Rick_Parte4.docx
+++ b/roteiros/rick/Rick_Parte4.docx
@@ -15,7 +15,7 @@
         <w:rPr>
           <w:color w:val="000000"/>
         </w:rPr>
-        <w:t>No fim de dois mil e catorze, Rick e Renner estavam de novo no topo.</w:t>
+        <w:t>No fim de dois mil e catorze, Rick e Renner estavam de volta à estrada.</w:t>
       </w:r>
     </w:p>
     <w:p>
@@ -23,7 +23,7 @@
         <w:rPr>
           <w:color w:val="000000"/>
         </w:rPr>
-        <w:t>Fazia dois anos que a dupla tinha voltado. As agendas estavam cheias, os contratantes tinham voltado a confiar, e o público cantava como se Gaspar nunca tivesse acontecido.</w:t>
+        <w:t>Fazia dois anos que a dupla tinha se reunido. Tinham lançado discos novos, e o público voltava a cantar com eles como se Gaspar nunca tivesse acontecido.</w:t>
       </w:r>
     </w:p>
     <w:p>

</xml_diff>